<commit_message>
Netinho: revisão da Parte 2
Co-Authored-By: Claude Opus 5.5 <noreply@anthropic.com>
Claude-Session: https://claude.ai/code/session_01MJjUEEZrxQDEUifKK2vj9g
</commit_message>
<xml_diff>
--- a/roteiros/netinho/Netinho_Parte2.docx
+++ b/roteiros/netinho/Netinho_Parte2.docx
@@ -55,7 +55,7 @@
         <w:rPr>
           <w:color w:val="000000"/>
         </w:rPr>
-        <w:t>Guarde essa pressão. Porque ela explica uma decisão que, anos depois, o próprio Netinho teria coragem de contar ao Brasil inteiro.</w:t>
+        <w:t>Guarde essa pressão. Porque foi justamente nesses anos de volta que aconteceu uma coisa que só muito tempo depois o próprio Netinho teria coragem de contar ao Brasil inteiro.</w:t>
       </w:r>
     </w:p>
     <w:p>
@@ -87,7 +87,7 @@
         <w:rPr>
           <w:color w:val="000000"/>
         </w:rPr>
-        <w:t>Ele não tentou esconder. Não tentou culpar o público, nem a pressão do mercado. Contou a verdade, com a coragem de quem já tinha passado pelo pior.</w:t>
+        <w:t>Ele não tentou esconder. Contou a verdade, com a coragem de quem já tinha passado pelo pior.</w:t>
       </w:r>
     </w:p>
     <w:p>
@@ -111,7 +111,7 @@
         <w:rPr>
           <w:color w:val="000000"/>
         </w:rPr>
-        <w:t>Abril de dois mil e treze. Salvador. Netinho estava num ensaio com a banda. Uma rotina que ele tinha repetido milhares de vezes na vida. Os músicos afinando os instrumentos, o repertório sendo passado música por música.</w:t>
+        <w:t>Abril de dois mil e treze. Salvador. Netinho estava num ensaio com a banda. Uma rotina que ele tinha repetido milhares de vezes na vida.</w:t>
       </w:r>
     </w:p>
     <w:p>
@@ -143,7 +143,15 @@
         <w:rPr>
           <w:color w:val="000000"/>
         </w:rPr>
-        <w:t>Ele foi levado ao Hospital Aliança, em Salvador.</w:t>
+        <w:t>Guarde essa imagem. Porque, treze anos depois, numa terça-feira de agosto de dois mil e vinte e seis, ele ia passar por outro susto, dessa vez dentro de um banheiro. E ele mesmo ia contar tudo aos fãs, fazendo piada. Nós vamos chegar lá.</w:t>
+      </w:r>
+    </w:p>
+    <w:p>
+      <w:r>
+        <w:rPr>
+          <w:color w:val="000000"/>
+        </w:rPr>
+        <w:t>Ele foi para o Hospital Aliança, em Salvador.</w:t>
       </w:r>
     </w:p>
     <w:p>
@@ -183,7 +191,7 @@
         <w:rPr>
           <w:color w:val="000000"/>
         </w:rPr>
-        <w:t>Em poucos dias, o cantor que tinha chegado ao hospital por causa de uma dor na perna estava lutando pela vida.</w:t>
+        <w:t>O cantor que tinha chegado ao hospital por causa de uma dor na perna agora estava lutando pela vida.</w:t>
       </w:r>
     </w:p>
     <w:p>
@@ -223,7 +231,7 @@
         <w:rPr>
           <w:color w:val="000000"/>
         </w:rPr>
-        <w:t>E, a partir daí, o corpo dele entrou numa sequência de golpes que pouca gente no mundo sobreviveria.</w:t>
+        <w:t>E, somando tudo o que ele enfrentou naqueles meses, a lista é de assustar.</w:t>
       </w:r>
     </w:p>
     <w:p>
@@ -383,7 +391,7 @@
         <w:rPr>
           <w:color w:val="000000"/>
         </w:rPr>
-        <w:t>Repara nisso. Um homem que tinha acabado de voltar da beira da morte, que ainda estava se recuperando, e a primeira coisa que ele quis lembrar foi de quem não tinha um hospital como o dele.</w:t>
+        <w:t>Repara nisso. Um homem que tinha acabado de voltar da beira da morte, que ainda estava se recuperando, e uma das coisas que ele fez questão de lembrar foi de quem não tinha um hospital como o dele.</w:t>
       </w:r>
     </w:p>
     <w:p>
@@ -399,7 +407,7 @@
         <w:rPr>
           <w:color w:val="000000"/>
         </w:rPr>
-        <w:t>E é aqui que a história fica ainda mais arrepiante. Porque aquela crise de dois mil e treze deixou marcas que nunca mais foram embora. O equilíbrio, a coordenação dos movimentos, a parte do cérebro que tinha sangrado.</w:t>
+        <w:t>E é aqui que a história fica ainda mais arrepiante. Porque aquela crise de dois mil e treze deixou marcas no corpo dele. No equilíbrio, na coordenação dos movimentos, na parte do cérebro que tinha sangrado. E essas marcas iam voltar a assustar.</w:t>
       </w:r>
     </w:p>
     <w:p>

</xml_diff>

<commit_message>
Netinho: Parte 3 (2014 a 2025) e correções de datas na Parte 2
Co-Authored-By: Claude Opus 5.5 <noreply@anthropic.com>
Claude-Session: https://claude.ai/code/session_01MJjUEEZrxQDEUifKK2vj9g
</commit_message>
<xml_diff>
--- a/roteiros/netinho/Netinho_Parte2.docx
+++ b/roteiros/netinho/Netinho_Parte2.docx
@@ -151,7 +151,7 @@
         <w:rPr>
           <w:color w:val="000000"/>
         </w:rPr>
-        <w:t>Ele foi para o Hospital Aliança, em Salvador.</w:t>
+        <w:t>Vinte e seis de abril. Ele deu entrada no Hospital Aliança, em Salvador.</w:t>
       </w:r>
     </w:p>
     <w:p>
@@ -199,7 +199,7 @@
         <w:rPr>
           <w:color w:val="000000"/>
         </w:rPr>
-        <w:t>A família e os amigos tomaram uma decisão. Tirar o Netinho de Salvador e levar para São Paulo, para o Hospital Sírio-Libanês.</w:t>
+        <w:t>A família e os amigos tomaram uma decisão. Dez de maio de dois mil e treze. Numa UTI aérea, o Netinho foi levado de Salvador para São Paulo, para o Hospital Sírio-Libanês.</w:t>
       </w:r>
     </w:p>
     <w:p>
@@ -207,7 +207,7 @@
         <w:rPr>
           <w:color w:val="000000"/>
         </w:rPr>
-        <w:t>Imagina você ser filha dele. Uma menina de catorze, quinze anos, vendo o pai, aquele homem que o Brasil inteiro conhecia pelo sorriso, sendo transferido de uma cidade para outra, entre a vida e a morte. Sem saber se ia voltar a ouvir a voz dele.</w:t>
+        <w:t>Imagina você ser filha dele. Uma adolescente, vendo o pai, aquele homem que o Brasil inteiro conhecia pelo sorriso, sendo transferido de uma cidade para outra, entre a vida e a morte. Sem saber se ia voltar a ouvir a voz dele.</w:t>
       </w:r>
     </w:p>
     <w:p>
@@ -223,7 +223,7 @@
         <w:rPr>
           <w:color w:val="000000"/>
         </w:rPr>
-        <w:t>Vinte e cinco de maio de dois mil e treze. Mais de um mês depois de chegar a São Paulo, Netinho sentiu uma dor de cabeça repentina. Os exames mostraram um sangramento no cerebelo, a parte do cérebro que controla o equilíbrio e a coordenação dos movimentos. Ele voltou para a UTI.</w:t>
+        <w:t>Vinte e cinco de maio de dois mil e treze. Quinze dias depois de chegar a São Paulo, Netinho sentiu uma dor de cabeça repentina. Os exames mostraram um sangramento no cerebelo, a parte do cérebro que controla o equilíbrio e a coordenação dos movimentos. Ele voltou para a UTI.</w:t>
       </w:r>
     </w:p>
     <w:p>
@@ -327,7 +327,23 @@
         <w:rPr>
           <w:color w:val="000000"/>
         </w:rPr>
-        <w:t>Ele admitiu que os resíduos dos anabolizantes podiam ter provocado ou acelerado a doença. Podiam. Nunca houve uma resposta definitiva. E, em outras entrevistas, ele também falou que houve erro médico no tratamento. Essa é a versão dele, de quem viveu tudo aquilo na própria pele.</w:t>
+        <w:t>Ele admitiu que os resíduos dos anabolizantes podiam ter provocado ou acelerado a doença. Podiam. Nunca houve uma resposta definitiva.</w:t>
+      </w:r>
+    </w:p>
+    <w:p>
+      <w:r>
+        <w:rPr>
+          <w:color w:val="000000"/>
+        </w:rPr>
+        <w:t>Mas, numa publicação nas redes sociais, naquele mesmo fevereiro de dois mil e catorze, ele não fugiu da responsabilidade. Escreveu com todas as letras. "Errei ao tomar anabolizantes no passado, mesmo sendo receitados por um médico e confiando nele." E completou. "A culpa é toda minha."</w:t>
+      </w:r>
+    </w:p>
+    <w:p>
+      <w:r>
+        <w:rPr>
+          <w:color w:val="000000"/>
+        </w:rPr>
+        <w:t>Poucos artistas no Brasil tiveram essa coragem. Admitir o erro em público, sem procurar culpados.</w:t>
       </w:r>
     </w:p>
     <w:p>

</xml_diff>